<commit_message>
feat: EDA complete, feature engineering with cyclical encoding, lag features, and weather variables
</commit_message>
<xml_diff>
--- a/learnings.docx
+++ b/learnings.docx
@@ -100,15 +100,7 @@
     </w:p>
     <w:p>
       <w:r>
-        <w:t xml:space="preserve">Client → Problem → Data → Features → Probabilistic Forecast → Dispatch Optimization → </w:t>
-      </w:r>
-      <w:proofErr w:type="spellStart"/>
-      <w:r>
-        <w:t>Backtest</w:t>
-      </w:r>
-      <w:proofErr w:type="spellEnd"/>
-      <w:r>
-        <w:t xml:space="preserve"> against naive benchmark → Business outcome in dollars.</w:t>
+        <w:t>Client → Problem → Data → Features → Probabilistic Forecast → Dispatch Optimization → Backtest against naive benchmark → Business outcome in dollars.</w:t>
       </w:r>
     </w:p>
     <w:p/>
@@ -438,10 +430,144 @@
       </w:r>
     </w:p>
     <w:p/>
+    <w:p>
+      <w:r>
+        <w:lastRenderedPageBreak/>
+        <w:t>The SettlementPointPrice is negative, why?</w:t>
+      </w:r>
+    </w:p>
+    <w:p>
+      <w:r>
+        <w:drawing>
+          <wp:inline distT="0" distB="0" distL="0" distR="0" wp14:anchorId="650F2C5C" wp14:editId="3C9B0499">
+            <wp:extent cx="5943600" cy="1188720"/>
+            <wp:effectExtent l="0" t="0" r="0" b="5080"/>
+            <wp:docPr id="491025818" name="Picture 1"/>
+            <wp:cNvGraphicFramePr>
+              <a:graphicFrameLocks xmlns:a="http://schemas.openxmlformats.org/drawingml/2006/main" noChangeAspect="1"/>
+            </wp:cNvGraphicFramePr>
+            <a:graphic xmlns:a="http://schemas.openxmlformats.org/drawingml/2006/main">
+              <a:graphicData uri="http://schemas.openxmlformats.org/drawingml/2006/picture">
+                <pic:pic xmlns:pic="http://schemas.openxmlformats.org/drawingml/2006/picture">
+                  <pic:nvPicPr>
+                    <pic:cNvPr id="491025818" name=""/>
+                    <pic:cNvPicPr/>
+                  </pic:nvPicPr>
+                  <pic:blipFill>
+                    <a:blip r:embed="rId9"/>
+                    <a:stretch>
+                      <a:fillRect/>
+                    </a:stretch>
+                  </pic:blipFill>
+                  <pic:spPr>
+                    <a:xfrm>
+                      <a:off x="0" y="0"/>
+                      <a:ext cx="5943600" cy="1188720"/>
+                    </a:xfrm>
+                    <a:prstGeom prst="rect">
+                      <a:avLst/>
+                    </a:prstGeom>
+                  </pic:spPr>
+                </pic:pic>
+              </a:graphicData>
+            </a:graphic>
+          </wp:inline>
+        </w:drawing>
+      </w:r>
+    </w:p>
+    <w:p/>
+    <w:p>
+      <w:r>
+        <w:br/>
+        <w:t>Resume points :</w:t>
+      </w:r>
+      <w:r>
+        <w:br/>
+      </w:r>
+      <w:r>
+        <w:br/>
+      </w:r>
+      <w:r>
+        <w:drawing>
+          <wp:inline distT="0" distB="0" distL="0" distR="0" wp14:anchorId="492C01C3" wp14:editId="59E72046">
+            <wp:extent cx="5943600" cy="560705"/>
+            <wp:effectExtent l="0" t="0" r="0" b="0"/>
+            <wp:docPr id="667651781" name="Picture 1"/>
+            <wp:cNvGraphicFramePr>
+              <a:graphicFrameLocks xmlns:a="http://schemas.openxmlformats.org/drawingml/2006/main" noChangeAspect="1"/>
+            </wp:cNvGraphicFramePr>
+            <a:graphic xmlns:a="http://schemas.openxmlformats.org/drawingml/2006/main">
+              <a:graphicData uri="http://schemas.openxmlformats.org/drawingml/2006/picture">
+                <pic:pic xmlns:pic="http://schemas.openxmlformats.org/drawingml/2006/picture">
+                  <pic:nvPicPr>
+                    <pic:cNvPr id="667651781" name=""/>
+                    <pic:cNvPicPr/>
+                  </pic:nvPicPr>
+                  <pic:blipFill>
+                    <a:blip r:embed="rId10"/>
+                    <a:stretch>
+                      <a:fillRect/>
+                    </a:stretch>
+                  </pic:blipFill>
+                  <pic:spPr>
+                    <a:xfrm>
+                      <a:off x="0" y="0"/>
+                      <a:ext cx="5943600" cy="560705"/>
+                    </a:xfrm>
+                    <a:prstGeom prst="rect">
+                      <a:avLst/>
+                    </a:prstGeom>
+                  </pic:spPr>
+                </pic:pic>
+              </a:graphicData>
+            </a:graphic>
+          </wp:inline>
+        </w:drawing>
+      </w:r>
+    </w:p>
     <w:p/>
     <w:p/>
+    <w:p>
+      <w:r>
+        <w:drawing>
+          <wp:inline distT="0" distB="0" distL="0" distR="0" wp14:anchorId="3540668C" wp14:editId="19AEB2FE">
+            <wp:extent cx="5943600" cy="1425575"/>
+            <wp:effectExtent l="0" t="0" r="0" b="0"/>
+            <wp:docPr id="1034176784" name="Picture 1"/>
+            <wp:cNvGraphicFramePr>
+              <a:graphicFrameLocks xmlns:a="http://schemas.openxmlformats.org/drawingml/2006/main" noChangeAspect="1"/>
+            </wp:cNvGraphicFramePr>
+            <a:graphic xmlns:a="http://schemas.openxmlformats.org/drawingml/2006/main">
+              <a:graphicData uri="http://schemas.openxmlformats.org/drawingml/2006/picture">
+                <pic:pic xmlns:pic="http://schemas.openxmlformats.org/drawingml/2006/picture">
+                  <pic:nvPicPr>
+                    <pic:cNvPr id="1034176784" name=""/>
+                    <pic:cNvPicPr/>
+                  </pic:nvPicPr>
+                  <pic:blipFill>
+                    <a:blip r:embed="rId11"/>
+                    <a:stretch>
+                      <a:fillRect/>
+                    </a:stretch>
+                  </pic:blipFill>
+                  <pic:spPr>
+                    <a:xfrm>
+                      <a:off x="0" y="0"/>
+                      <a:ext cx="5943600" cy="1425575"/>
+                    </a:xfrm>
+                    <a:prstGeom prst="rect">
+                      <a:avLst/>
+                    </a:prstGeom>
+                  </pic:spPr>
+                </pic:pic>
+              </a:graphicData>
+            </a:graphic>
+          </wp:inline>
+        </w:drawing>
+      </w:r>
+    </w:p>
     <w:sectPr>
-      <w:headerReference w:type="default" r:id="rId9"/>
+      <w:headerReference w:type="default" r:id="rId12"/>
       <w:pgSz w:w="12240" w:h="15840"/>
       <w:pgMar w:top="1440" w:right="1440" w:bottom="1440" w:left="1440" w:header="720" w:footer="720" w:gutter="0"/>
       <w:cols w:space="720"/>

</xml_diff>

<commit_message>
feat: price forecasting + dashboard completion
</commit_message>
<xml_diff>
--- a/learnings.docx
+++ b/learnings.docx
@@ -566,8 +566,104 @@
         </w:drawing>
       </w:r>
     </w:p>
+    <w:p/>
+    <w:p>
+      <w:r>
+        <w:t>Metrics:</w:t>
+      </w:r>
+    </w:p>
+    <w:p>
+      <w:r>
+        <w:rPr>
+          <w:noProof/>
+        </w:rPr>
+        <w:lastRenderedPageBreak/>
+        <w:drawing>
+          <wp:inline distT="0" distB="0" distL="0" distR="0" wp14:anchorId="31BAB59C" wp14:editId="5EA605E3">
+            <wp:extent cx="5943600" cy="3327400"/>
+            <wp:effectExtent l="0" t="0" r="0" b="0"/>
+            <wp:docPr id="365706489" name="Picture 1"/>
+            <wp:cNvGraphicFramePr>
+              <a:graphicFrameLocks xmlns:a="http://schemas.openxmlformats.org/drawingml/2006/main" noChangeAspect="1"/>
+            </wp:cNvGraphicFramePr>
+            <a:graphic xmlns:a="http://schemas.openxmlformats.org/drawingml/2006/main">
+              <a:graphicData uri="http://schemas.openxmlformats.org/drawingml/2006/picture">
+                <pic:pic xmlns:pic="http://schemas.openxmlformats.org/drawingml/2006/picture">
+                  <pic:nvPicPr>
+                    <pic:cNvPr id="365706489" name="Picture 365706489"/>
+                    <pic:cNvPicPr/>
+                  </pic:nvPicPr>
+                  <pic:blipFill>
+                    <a:blip r:embed="rId12" cstate="print">
+                      <a:extLst>
+                        <a:ext uri="{28A0092B-C50C-407E-A947-70E740481C1C}">
+                          <a14:useLocalDpi xmlns:a14="http://schemas.microsoft.com/office/drawing/2010/main" val="0"/>
+                        </a:ext>
+                      </a:extLst>
+                    </a:blip>
+                    <a:stretch>
+                      <a:fillRect/>
+                    </a:stretch>
+                  </pic:blipFill>
+                  <pic:spPr>
+                    <a:xfrm>
+                      <a:off x="0" y="0"/>
+                      <a:ext cx="5943600" cy="3327400"/>
+                    </a:xfrm>
+                    <a:prstGeom prst="rect">
+                      <a:avLst/>
+                    </a:prstGeom>
+                  </pic:spPr>
+                </pic:pic>
+              </a:graphicData>
+            </a:graphic>
+          </wp:inline>
+        </w:drawing>
+      </w:r>
+    </w:p>
+    <w:p/>
+    <w:p/>
+    <w:p>
+      <w:r>
+        <w:drawing>
+          <wp:inline distT="0" distB="0" distL="0" distR="0" wp14:anchorId="5D4B3BAD" wp14:editId="30D46150">
+            <wp:extent cx="5943600" cy="3783965"/>
+            <wp:effectExtent l="0" t="0" r="0" b="635"/>
+            <wp:docPr id="214542576" name="Picture 1"/>
+            <wp:cNvGraphicFramePr>
+              <a:graphicFrameLocks xmlns:a="http://schemas.openxmlformats.org/drawingml/2006/main" noChangeAspect="1"/>
+            </wp:cNvGraphicFramePr>
+            <a:graphic xmlns:a="http://schemas.openxmlformats.org/drawingml/2006/main">
+              <a:graphicData uri="http://schemas.openxmlformats.org/drawingml/2006/picture">
+                <pic:pic xmlns:pic="http://schemas.openxmlformats.org/drawingml/2006/picture">
+                  <pic:nvPicPr>
+                    <pic:cNvPr id="214542576" name=""/>
+                    <pic:cNvPicPr/>
+                  </pic:nvPicPr>
+                  <pic:blipFill>
+                    <a:blip r:embed="rId13"/>
+                    <a:stretch>
+                      <a:fillRect/>
+                    </a:stretch>
+                  </pic:blipFill>
+                  <pic:spPr>
+                    <a:xfrm>
+                      <a:off x="0" y="0"/>
+                      <a:ext cx="5943600" cy="3783965"/>
+                    </a:xfrm>
+                    <a:prstGeom prst="rect">
+                      <a:avLst/>
+                    </a:prstGeom>
+                  </pic:spPr>
+                </pic:pic>
+              </a:graphicData>
+            </a:graphic>
+          </wp:inline>
+        </w:drawing>
+      </w:r>
+    </w:p>
     <w:sectPr>
-      <w:headerReference w:type="default" r:id="rId12"/>
+      <w:headerReference w:type="default" r:id="rId14"/>
       <w:pgSz w:w="12240" w:h="15840"/>
       <w:pgMar w:top="1440" w:right="1440" w:bottom="1440" w:left="1440" w:header="720" w:footer="720" w:gutter="0"/>
       <w:cols w:space="720"/>

</xml_diff>